<commit_message>
covariate info & fixed effect only posterior predictives for training
</commit_message>
<xml_diff>
--- a/CRPS_Table.docx
+++ b/CRPS_Table.docx
@@ -571,7 +571,7 @@
                 <w:szCs w:val="22"/>
                 <w:color w:val="000000"/>
               </w:rPr>
-              <w:t xml:space="preserve">Reproduction (train)</w:t>
+              <w:t xml:space="preserve">Fecundity (train, fixed)</w:t>
             </w:r>
           </w:p>
         </w:tc>
@@ -624,7 +624,7 @@
                 <w:szCs w:val="22"/>
                 <w:color w:val="000000"/>
               </w:rPr>
-              <w:t xml:space="preserve">0.214</w:t>
+              <w:t xml:space="preserve">105.925</w:t>
             </w:r>
           </w:p>
         </w:tc>
@@ -677,7 +677,7 @@
                 <w:szCs w:val="22"/>
                 <w:color w:val="000000"/>
               </w:rPr>
-              <w:t xml:space="preserve">0.143</w:t>
+              <w:t xml:space="preserve">0.478</w:t>
             </w:r>
           </w:p>
         </w:tc>
@@ -736,7 +736,7 @@
                 <w:szCs w:val="22"/>
                 <w:color w:val="000000"/>
               </w:rPr>
-              <w:t xml:space="preserve">Reproduction (test)</w:t>
+              <w:t xml:space="preserve">Reproduction (train)</w:t>
             </w:r>
           </w:p>
         </w:tc>
@@ -789,7 +789,7 @@
                 <w:szCs w:val="22"/>
                 <w:color w:val="000000"/>
               </w:rPr>
-              <w:t xml:space="preserve">0.243</w:t>
+              <w:t xml:space="preserve">0.214</w:t>
             </w:r>
           </w:p>
         </w:tc>
@@ -842,7 +842,7 @@
                 <w:szCs w:val="22"/>
                 <w:color w:val="000000"/>
               </w:rPr>
-              <w:t xml:space="preserve">0.030</w:t>
+              <w:t xml:space="preserve">0.143</w:t>
             </w:r>
           </w:p>
         </w:tc>
@@ -901,6 +901,336 @@
                 <w:szCs w:val="22"/>
                 <w:color w:val="000000"/>
               </w:rPr>
+              <w:t xml:space="preserve">Reproduction (test)</w:t>
+            </w:r>
+          </w:p>
+        </w:tc>
+        <w:tc>
+          <w:tcPr>
+            <w:tcBorders>
+              <w:bottom w:val="none" w:sz="0" w:space="0" w:color="000000"/>
+              <w:top w:val="none" w:sz="0" w:space="0" w:color="000000"/>
+              <w:left w:val="none" w:sz="0" w:space="0" w:color="000000"/>
+              <w:right w:val="none" w:sz="0" w:space="0" w:color="000000"/>
+            </w:tcBorders>
+            <w:shd w:val="clear" w:color="auto" w:fill="FFFFFF"/>
+            <w:tcMar>
+              <w:top w:w="0" w:type="dxa"/>
+              <w:bottom w:w="0" w:type="dxa"/>
+              <w:left w:w="0" w:type="dxa"/>
+              <w:right w:w="0" w:type="dxa"/>
+            </w:tcMar>
+            <w:vAlign w:val="center"/>
+          </w:tcPr>
+          <w:p>
+            <w:pPr>
+              <w:pStyle w:val="Normal"/>
+              <w:jc w:val="right"/>
+              <w:pBdr>
+                <w:bottom w:val="none" w:sz="0" w:space="0" w:color="000000"/>
+                <w:top w:val="none" w:sz="0" w:space="0" w:color="000000"/>
+                <w:left w:val="none" w:sz="0" w:space="0" w:color="000000"/>
+                <w:right w:val="none" w:sz="0" w:space="0" w:color="000000"/>
+              </w:pBdr>
+              <w:spacing w:after="100" w:before="100" w:line="240"/>
+              <w:ind w:left="100" w:right="100" w:firstLine="0" w:firstLineChars="0"/>
+              <w:rPr>
+                <w:rFonts w:ascii="Helvetica" w:hAnsi="Helvetica" w:eastAsia="Helvetica" w:cs="Helvetica"/>
+                <w:i w:val="false"/>
+                <w:b w:val="false"/>
+                <w:u w:val="none"/>
+                <w:sz w:val="22"/>
+                <w:szCs w:val="22"/>
+                <w:color w:val="000000"/>
+              </w:rPr>
+            </w:pPr>
+            <w:r>
+              <w:rPr>
+                <w:rFonts w:ascii="Helvetica" w:hAnsi="Helvetica" w:eastAsia="Helvetica" w:cs="Helvetica"/>
+                <w:i w:val="false"/>
+                <w:b w:val="false"/>
+                <w:u w:val="none"/>
+                <w:sz w:val="22"/>
+                <w:szCs w:val="22"/>
+                <w:color w:val="000000"/>
+              </w:rPr>
+              <w:t xml:space="preserve">0.243</w:t>
+            </w:r>
+          </w:p>
+        </w:tc>
+        <w:tc>
+          <w:tcPr>
+            <w:tcBorders>
+              <w:bottom w:val="none" w:sz="0" w:space="0" w:color="000000"/>
+              <w:top w:val="none" w:sz="0" w:space="0" w:color="000000"/>
+              <w:left w:val="none" w:sz="0" w:space="0" w:color="000000"/>
+              <w:right w:val="none" w:sz="0" w:space="0" w:color="000000"/>
+            </w:tcBorders>
+            <w:shd w:val="clear" w:color="auto" w:fill="FFFFFF"/>
+            <w:tcMar>
+              <w:top w:w="0" w:type="dxa"/>
+              <w:bottom w:w="0" w:type="dxa"/>
+              <w:left w:w="0" w:type="dxa"/>
+              <w:right w:w="0" w:type="dxa"/>
+            </w:tcMar>
+            <w:vAlign w:val="center"/>
+          </w:tcPr>
+          <w:p>
+            <w:pPr>
+              <w:pStyle w:val="Normal"/>
+              <w:jc w:val="right"/>
+              <w:pBdr>
+                <w:bottom w:val="none" w:sz="0" w:space="0" w:color="000000"/>
+                <w:top w:val="none" w:sz="0" w:space="0" w:color="000000"/>
+                <w:left w:val="none" w:sz="0" w:space="0" w:color="000000"/>
+                <w:right w:val="none" w:sz="0" w:space="0" w:color="000000"/>
+              </w:pBdr>
+              <w:spacing w:after="100" w:before="100" w:line="240"/>
+              <w:ind w:left="100" w:right="100" w:firstLine="0" w:firstLineChars="0"/>
+              <w:rPr>
+                <w:rFonts w:ascii="Helvetica" w:hAnsi="Helvetica" w:eastAsia="Helvetica" w:cs="Helvetica"/>
+                <w:i w:val="false"/>
+                <w:b w:val="false"/>
+                <w:u w:val="none"/>
+                <w:sz w:val="22"/>
+                <w:szCs w:val="22"/>
+                <w:color w:val="000000"/>
+              </w:rPr>
+            </w:pPr>
+            <w:r>
+              <w:rPr>
+                <w:rFonts w:ascii="Helvetica" w:hAnsi="Helvetica" w:eastAsia="Helvetica" w:cs="Helvetica"/>
+                <w:i w:val="false"/>
+                <w:b w:val="false"/>
+                <w:u w:val="none"/>
+                <w:sz w:val="22"/>
+                <w:szCs w:val="22"/>
+                <w:color w:val="000000"/>
+              </w:rPr>
+              <w:t xml:space="preserve">0.030</w:t>
+            </w:r>
+          </w:p>
+        </w:tc>
+      </w:tr>
+      <w:tr>
+        <w:trPr>
+          <w:trHeight w:val="360" w:hRule="auto"/>
+        </w:trPr>
+        body6
+        <w:tc>
+          <w:tcPr>
+            <w:tcBorders>
+              <w:bottom w:val="none" w:sz="0" w:space="0" w:color="000000"/>
+              <w:top w:val="none" w:sz="0" w:space="0" w:color="000000"/>
+              <w:left w:val="none" w:sz="0" w:space="0" w:color="000000"/>
+              <w:right w:val="none" w:sz="0" w:space="0" w:color="000000"/>
+            </w:tcBorders>
+            <w:shd w:val="clear" w:color="auto" w:fill="FFFFFF"/>
+            <w:tcMar>
+              <w:top w:w="0" w:type="dxa"/>
+              <w:bottom w:w="0" w:type="dxa"/>
+              <w:left w:w="0" w:type="dxa"/>
+              <w:right w:w="0" w:type="dxa"/>
+            </w:tcMar>
+            <w:vAlign w:val="center"/>
+          </w:tcPr>
+          <w:p>
+            <w:pPr>
+              <w:pStyle w:val="Normal"/>
+              <w:jc w:val="left"/>
+              <w:pBdr>
+                <w:bottom w:val="none" w:sz="0" w:space="0" w:color="000000"/>
+                <w:top w:val="none" w:sz="0" w:space="0" w:color="000000"/>
+                <w:left w:val="none" w:sz="0" w:space="0" w:color="000000"/>
+                <w:right w:val="none" w:sz="0" w:space="0" w:color="000000"/>
+              </w:pBdr>
+              <w:spacing w:after="100" w:before="100" w:line="240"/>
+              <w:ind w:left="100" w:right="100" w:firstLine="0" w:firstLineChars="0"/>
+              <w:rPr>
+                <w:rFonts w:ascii="Helvetica" w:hAnsi="Helvetica" w:eastAsia="Helvetica" w:cs="Helvetica"/>
+                <w:i w:val="false"/>
+                <w:b w:val="false"/>
+                <w:u w:val="none"/>
+                <w:sz w:val="22"/>
+                <w:szCs w:val="22"/>
+                <w:color w:val="000000"/>
+              </w:rPr>
+            </w:pPr>
+            <w:r>
+              <w:rPr>
+                <w:rFonts w:ascii="Helvetica" w:hAnsi="Helvetica" w:eastAsia="Helvetica" w:cs="Helvetica"/>
+                <w:i w:val="false"/>
+                <w:b w:val="false"/>
+                <w:u w:val="none"/>
+                <w:sz w:val="22"/>
+                <w:szCs w:val="22"/>
+                <w:color w:val="000000"/>
+              </w:rPr>
+              <w:t xml:space="preserve">Reproduction (train, fixed)</w:t>
+            </w:r>
+          </w:p>
+        </w:tc>
+        <w:tc>
+          <w:tcPr>
+            <w:tcBorders>
+              <w:bottom w:val="none" w:sz="0" w:space="0" w:color="000000"/>
+              <w:top w:val="none" w:sz="0" w:space="0" w:color="000000"/>
+              <w:left w:val="none" w:sz="0" w:space="0" w:color="000000"/>
+              <w:right w:val="none" w:sz="0" w:space="0" w:color="000000"/>
+            </w:tcBorders>
+            <w:shd w:val="clear" w:color="auto" w:fill="FFFFFF"/>
+            <w:tcMar>
+              <w:top w:w="0" w:type="dxa"/>
+              <w:bottom w:w="0" w:type="dxa"/>
+              <w:left w:w="0" w:type="dxa"/>
+              <w:right w:w="0" w:type="dxa"/>
+            </w:tcMar>
+            <w:vAlign w:val="center"/>
+          </w:tcPr>
+          <w:p>
+            <w:pPr>
+              <w:pStyle w:val="Normal"/>
+              <w:jc w:val="right"/>
+              <w:pBdr>
+                <w:bottom w:val="none" w:sz="0" w:space="0" w:color="000000"/>
+                <w:top w:val="none" w:sz="0" w:space="0" w:color="000000"/>
+                <w:left w:val="none" w:sz="0" w:space="0" w:color="000000"/>
+                <w:right w:val="none" w:sz="0" w:space="0" w:color="000000"/>
+              </w:pBdr>
+              <w:spacing w:after="100" w:before="100" w:line="240"/>
+              <w:ind w:left="100" w:right="100" w:firstLine="0" w:firstLineChars="0"/>
+              <w:rPr>
+                <w:rFonts w:ascii="Helvetica" w:hAnsi="Helvetica" w:eastAsia="Helvetica" w:cs="Helvetica"/>
+                <w:i w:val="false"/>
+                <w:b w:val="false"/>
+                <w:u w:val="none"/>
+                <w:sz w:val="22"/>
+                <w:szCs w:val="22"/>
+                <w:color w:val="000000"/>
+              </w:rPr>
+            </w:pPr>
+            <w:r>
+              <w:rPr>
+                <w:rFonts w:ascii="Helvetica" w:hAnsi="Helvetica" w:eastAsia="Helvetica" w:cs="Helvetica"/>
+                <w:i w:val="false"/>
+                <w:b w:val="false"/>
+                <w:u w:val="none"/>
+                <w:sz w:val="22"/>
+                <w:szCs w:val="22"/>
+                <w:color w:val="000000"/>
+              </w:rPr>
+              <w:t xml:space="preserve">0.255</w:t>
+            </w:r>
+          </w:p>
+        </w:tc>
+        <w:tc>
+          <w:tcPr>
+            <w:tcBorders>
+              <w:bottom w:val="none" w:sz="0" w:space="0" w:color="000000"/>
+              <w:top w:val="none" w:sz="0" w:space="0" w:color="000000"/>
+              <w:left w:val="none" w:sz="0" w:space="0" w:color="000000"/>
+              <w:right w:val="none" w:sz="0" w:space="0" w:color="000000"/>
+            </w:tcBorders>
+            <w:shd w:val="clear" w:color="auto" w:fill="FFFFFF"/>
+            <w:tcMar>
+              <w:top w:w="0" w:type="dxa"/>
+              <w:bottom w:w="0" w:type="dxa"/>
+              <w:left w:w="0" w:type="dxa"/>
+              <w:right w:w="0" w:type="dxa"/>
+            </w:tcMar>
+            <w:vAlign w:val="center"/>
+          </w:tcPr>
+          <w:p>
+            <w:pPr>
+              <w:pStyle w:val="Normal"/>
+              <w:jc w:val="right"/>
+              <w:pBdr>
+                <w:bottom w:val="none" w:sz="0" w:space="0" w:color="000000"/>
+                <w:top w:val="none" w:sz="0" w:space="0" w:color="000000"/>
+                <w:left w:val="none" w:sz="0" w:space="0" w:color="000000"/>
+                <w:right w:val="none" w:sz="0" w:space="0" w:color="000000"/>
+              </w:pBdr>
+              <w:spacing w:after="100" w:before="100" w:line="240"/>
+              <w:ind w:left="100" w:right="100" w:firstLine="0" w:firstLineChars="0"/>
+              <w:rPr>
+                <w:rFonts w:ascii="Helvetica" w:hAnsi="Helvetica" w:eastAsia="Helvetica" w:cs="Helvetica"/>
+                <w:i w:val="false"/>
+                <w:b w:val="false"/>
+                <w:u w:val="none"/>
+                <w:sz w:val="22"/>
+                <w:szCs w:val="22"/>
+                <w:color w:val="000000"/>
+              </w:rPr>
+            </w:pPr>
+            <w:r>
+              <w:rPr>
+                <w:rFonts w:ascii="Helvetica" w:hAnsi="Helvetica" w:eastAsia="Helvetica" w:cs="Helvetica"/>
+                <w:i w:val="false"/>
+                <w:b w:val="false"/>
+                <w:u w:val="none"/>
+                <w:sz w:val="22"/>
+                <w:szCs w:val="22"/>
+                <w:color w:val="000000"/>
+              </w:rPr>
+              <w:t xml:space="preserve">-0.020</w:t>
+            </w:r>
+          </w:p>
+        </w:tc>
+      </w:tr>
+      <w:tr>
+        <w:trPr>
+          <w:trHeight w:val="360" w:hRule="auto"/>
+        </w:trPr>
+        body7
+        <w:tc>
+          <w:tcPr>
+            <w:tcBorders>
+              <w:bottom w:val="none" w:sz="0" w:space="0" w:color="000000"/>
+              <w:top w:val="none" w:sz="0" w:space="0" w:color="000000"/>
+              <w:left w:val="none" w:sz="0" w:space="0" w:color="000000"/>
+              <w:right w:val="none" w:sz="0" w:space="0" w:color="000000"/>
+            </w:tcBorders>
+            <w:shd w:val="clear" w:color="auto" w:fill="FFFFFF"/>
+            <w:tcMar>
+              <w:top w:w="0" w:type="dxa"/>
+              <w:bottom w:w="0" w:type="dxa"/>
+              <w:left w:w="0" w:type="dxa"/>
+              <w:right w:w="0" w:type="dxa"/>
+            </w:tcMar>
+            <w:vAlign w:val="center"/>
+          </w:tcPr>
+          <w:p>
+            <w:pPr>
+              <w:pStyle w:val="Normal"/>
+              <w:jc w:val="left"/>
+              <w:pBdr>
+                <w:bottom w:val="none" w:sz="0" w:space="0" w:color="000000"/>
+                <w:top w:val="none" w:sz="0" w:space="0" w:color="000000"/>
+                <w:left w:val="none" w:sz="0" w:space="0" w:color="000000"/>
+                <w:right w:val="none" w:sz="0" w:space="0" w:color="000000"/>
+              </w:pBdr>
+              <w:spacing w:after="100" w:before="100" w:line="240"/>
+              <w:ind w:left="100" w:right="100" w:firstLine="0" w:firstLineChars="0"/>
+              <w:rPr>
+                <w:rFonts w:ascii="Helvetica" w:hAnsi="Helvetica" w:eastAsia="Helvetica" w:cs="Helvetica"/>
+                <w:i w:val="false"/>
+                <w:b w:val="false"/>
+                <w:u w:val="none"/>
+                <w:sz w:val="22"/>
+                <w:szCs w:val="22"/>
+                <w:color w:val="000000"/>
+              </w:rPr>
+            </w:pPr>
+            <w:r>
+              <w:rPr>
+                <w:rFonts w:ascii="Helvetica" w:hAnsi="Helvetica" w:eastAsia="Helvetica" w:cs="Helvetica"/>
+                <w:i w:val="false"/>
+                <w:b w:val="false"/>
+                <w:u w:val="none"/>
+                <w:sz w:val="22"/>
+                <w:szCs w:val="22"/>
+                <w:color w:val="000000"/>
+              </w:rPr>
               <w:t xml:space="preserve">Emergence (train)</w:t>
             </w:r>
           </w:p>
@@ -1016,7 +1346,172 @@
         <w:trPr>
           <w:trHeight w:val="360" w:hRule="auto"/>
         </w:trPr>
-        body6
+        body8
+        <w:tc>
+          <w:tcPr>
+            <w:tcBorders>
+              <w:bottom w:val="none" w:sz="0" w:space="0" w:color="000000"/>
+              <w:top w:val="none" w:sz="0" w:space="0" w:color="000000"/>
+              <w:left w:val="none" w:sz="0" w:space="0" w:color="000000"/>
+              <w:right w:val="none" w:sz="0" w:space="0" w:color="000000"/>
+            </w:tcBorders>
+            <w:shd w:val="clear" w:color="auto" w:fill="FFFFFF"/>
+            <w:tcMar>
+              <w:top w:w="0" w:type="dxa"/>
+              <w:bottom w:w="0" w:type="dxa"/>
+              <w:left w:w="0" w:type="dxa"/>
+              <w:right w:w="0" w:type="dxa"/>
+            </w:tcMar>
+            <w:vAlign w:val="center"/>
+          </w:tcPr>
+          <w:p>
+            <w:pPr>
+              <w:pStyle w:val="Normal"/>
+              <w:jc w:val="left"/>
+              <w:pBdr>
+                <w:bottom w:val="none" w:sz="0" w:space="0" w:color="000000"/>
+                <w:top w:val="none" w:sz="0" w:space="0" w:color="000000"/>
+                <w:left w:val="none" w:sz="0" w:space="0" w:color="000000"/>
+                <w:right w:val="none" w:sz="0" w:space="0" w:color="000000"/>
+              </w:pBdr>
+              <w:spacing w:after="100" w:before="100" w:line="240"/>
+              <w:ind w:left="100" w:right="100" w:firstLine="0" w:firstLineChars="0"/>
+              <w:rPr>
+                <w:rFonts w:ascii="Helvetica" w:hAnsi="Helvetica" w:eastAsia="Helvetica" w:cs="Helvetica"/>
+                <w:i w:val="false"/>
+                <w:b w:val="false"/>
+                <w:u w:val="none"/>
+                <w:sz w:val="22"/>
+                <w:szCs w:val="22"/>
+                <w:color w:val="000000"/>
+              </w:rPr>
+            </w:pPr>
+            <w:r>
+              <w:rPr>
+                <w:rFonts w:ascii="Helvetica" w:hAnsi="Helvetica" w:eastAsia="Helvetica" w:cs="Helvetica"/>
+                <w:i w:val="false"/>
+                <w:b w:val="false"/>
+                <w:u w:val="none"/>
+                <w:sz w:val="22"/>
+                <w:szCs w:val="22"/>
+                <w:color w:val="000000"/>
+              </w:rPr>
+              <w:t xml:space="preserve">Emergence (test)</w:t>
+            </w:r>
+          </w:p>
+        </w:tc>
+        <w:tc>
+          <w:tcPr>
+            <w:tcBorders>
+              <w:bottom w:val="none" w:sz="0" w:space="0" w:color="000000"/>
+              <w:top w:val="none" w:sz="0" w:space="0" w:color="000000"/>
+              <w:left w:val="none" w:sz="0" w:space="0" w:color="000000"/>
+              <w:right w:val="none" w:sz="0" w:space="0" w:color="000000"/>
+            </w:tcBorders>
+            <w:shd w:val="clear" w:color="auto" w:fill="FFFFFF"/>
+            <w:tcMar>
+              <w:top w:w="0" w:type="dxa"/>
+              <w:bottom w:w="0" w:type="dxa"/>
+              <w:left w:w="0" w:type="dxa"/>
+              <w:right w:w="0" w:type="dxa"/>
+            </w:tcMar>
+            <w:vAlign w:val="center"/>
+          </w:tcPr>
+          <w:p>
+            <w:pPr>
+              <w:pStyle w:val="Normal"/>
+              <w:jc w:val="right"/>
+              <w:pBdr>
+                <w:bottom w:val="none" w:sz="0" w:space="0" w:color="000000"/>
+                <w:top w:val="none" w:sz="0" w:space="0" w:color="000000"/>
+                <w:left w:val="none" w:sz="0" w:space="0" w:color="000000"/>
+                <w:right w:val="none" w:sz="0" w:space="0" w:color="000000"/>
+              </w:pBdr>
+              <w:spacing w:after="100" w:before="100" w:line="240"/>
+              <w:ind w:left="100" w:right="100" w:firstLine="0" w:firstLineChars="0"/>
+              <w:rPr>
+                <w:rFonts w:ascii="Helvetica" w:hAnsi="Helvetica" w:eastAsia="Helvetica" w:cs="Helvetica"/>
+                <w:i w:val="false"/>
+                <w:b w:val="false"/>
+                <w:u w:val="none"/>
+                <w:sz w:val="22"/>
+                <w:szCs w:val="22"/>
+                <w:color w:val="000000"/>
+              </w:rPr>
+            </w:pPr>
+            <w:r>
+              <w:rPr>
+                <w:rFonts w:ascii="Helvetica" w:hAnsi="Helvetica" w:eastAsia="Helvetica" w:cs="Helvetica"/>
+                <w:i w:val="false"/>
+                <w:b w:val="false"/>
+                <w:u w:val="none"/>
+                <w:sz w:val="22"/>
+                <w:szCs w:val="22"/>
+                <w:color w:val="000000"/>
+              </w:rPr>
+              <w:t xml:space="preserve">0.279</w:t>
+            </w:r>
+          </w:p>
+        </w:tc>
+        <w:tc>
+          <w:tcPr>
+            <w:tcBorders>
+              <w:bottom w:val="none" w:sz="0" w:space="0" w:color="000000"/>
+              <w:top w:val="none" w:sz="0" w:space="0" w:color="000000"/>
+              <w:left w:val="none" w:sz="0" w:space="0" w:color="000000"/>
+              <w:right w:val="none" w:sz="0" w:space="0" w:color="000000"/>
+            </w:tcBorders>
+            <w:shd w:val="clear" w:color="auto" w:fill="FFFFFF"/>
+            <w:tcMar>
+              <w:top w:w="0" w:type="dxa"/>
+              <w:bottom w:w="0" w:type="dxa"/>
+              <w:left w:w="0" w:type="dxa"/>
+              <w:right w:w="0" w:type="dxa"/>
+            </w:tcMar>
+            <w:vAlign w:val="center"/>
+          </w:tcPr>
+          <w:p>
+            <w:pPr>
+              <w:pStyle w:val="Normal"/>
+              <w:jc w:val="right"/>
+              <w:pBdr>
+                <w:bottom w:val="none" w:sz="0" w:space="0" w:color="000000"/>
+                <w:top w:val="none" w:sz="0" w:space="0" w:color="000000"/>
+                <w:left w:val="none" w:sz="0" w:space="0" w:color="000000"/>
+                <w:right w:val="none" w:sz="0" w:space="0" w:color="000000"/>
+              </w:pBdr>
+              <w:spacing w:after="100" w:before="100" w:line="240"/>
+              <w:ind w:left="100" w:right="100" w:firstLine="0" w:firstLineChars="0"/>
+              <w:rPr>
+                <w:rFonts w:ascii="Helvetica" w:hAnsi="Helvetica" w:eastAsia="Helvetica" w:cs="Helvetica"/>
+                <w:i w:val="false"/>
+                <w:b w:val="false"/>
+                <w:u w:val="none"/>
+                <w:sz w:val="22"/>
+                <w:szCs w:val="22"/>
+                <w:color w:val="000000"/>
+              </w:rPr>
+            </w:pPr>
+            <w:r>
+              <w:rPr>
+                <w:rFonts w:ascii="Helvetica" w:hAnsi="Helvetica" w:eastAsia="Helvetica" w:cs="Helvetica"/>
+                <w:i w:val="false"/>
+                <w:b w:val="false"/>
+                <w:u w:val="none"/>
+                <w:sz w:val="22"/>
+                <w:szCs w:val="22"/>
+                <w:color w:val="000000"/>
+              </w:rPr>
+              <w:t xml:space="preserve">-0.534</w:t>
+            </w:r>
+          </w:p>
+        </w:tc>
+      </w:tr>
+      <w:tr>
+        <w:trPr>
+          <w:trHeight w:val="360" w:hRule="auto"/>
+        </w:trPr>
+        body9
         <w:tc>
           <w:tcPr>
             <w:tcBorders>
@@ -1066,7 +1561,7 @@
                 <w:szCs w:val="22"/>
                 <w:color w:val="000000"/>
               </w:rPr>
-              <w:t xml:space="preserve">Emergence (test)</w:t>
+              <w:t xml:space="preserve">Emergence (train, fixed)</w:t>
             </w:r>
           </w:p>
         </w:tc>
@@ -1119,7 +1614,7 @@
                 <w:szCs w:val="22"/>
                 <w:color w:val="000000"/>
               </w:rPr>
-              <w:t xml:space="preserve">0.279</w:t>
+              <w:t xml:space="preserve">0.186</w:t>
             </w:r>
           </w:p>
         </w:tc>
@@ -1172,7 +1667,7 @@
                 <w:szCs w:val="22"/>
                 <w:color w:val="000000"/>
               </w:rPr>
-              <w:t xml:space="preserve">-0.534</w:t>
+              <w:t xml:space="preserve">-0.023</w:t>
             </w:r>
           </w:p>
         </w:tc>

</xml_diff>